<commit_message>
Update vegan evidence library and master debate sheet
</commit_message>
<xml_diff>
--- a/docs/veganism_debate_master_sheet.docx
+++ b/docs/veganism_debate_master_sheet.docx
@@ -142,13 +142,17 @@
               </w:rPr>
               <w:t xml:space="preserve">SOURCE: The Vegan Society - formal definition  </w:t>
             </w:r>
-            <w:r>
-              <w:rPr>
-                <w:i/>
-                <w:sz w:val="10"/>
-              </w:rPr>
-              <w:t>https://www.vegansociety.com/go-vegan/definition-veganism</w:t>
-            </w:r>
+            <w:hyperlink r:id="rId18">
+              <w:r>
+                <w:rPr>
+                  <w:i/>
+                  <w:sz w:val="10"/>
+                  <w:color w:val="0563C1"/>
+                  <w:u w:val="single"/>
+                </w:rPr>
+                <w:t>https://www.vegansociety.com/go-vegan/definition-veganism</w:t>
+              </w:r>
+            </w:hyperlink>
           </w:p>
         </w:tc>
       </w:tr>
@@ -199,13 +203,19 @@
                 <w:b/>
                 <w:sz w:val="14"/>
               </w:rPr>
-              <w:t xml:space="preserve">Adequacy: </w:t>
+              <w:rPr>
+                <w:b/>
+              </w:rPr>
+              <w:t>Adequacy:</w:t>
             </w:r>
             <w:r>
               <w:rPr>
                 <w:sz w:val="13"/>
               </w:rPr>
-              <w:t>Appropriately planned vegan diets can be nutritionally adequate for adults and support long-term cardiometabolic health.</w:t>
+              <w:rPr>
+                <w:b w:val="0"/>
+              </w:rPr>
+              <w:t xml:space="preserve"> Appropriately planned vegetarian diets, including vegan diets, can be nutritionally adequate and appropriate for all stages of the life cycle.</w:t>
             </w:r>
           </w:p>
           <w:p>
@@ -217,16 +227,27 @@
                 <w:b/>
                 <w:sz w:val="11"/>
               </w:rPr>
-              <w:t>SOURCE: Academy of Nutrition and Dietetics position (2025)</w:t>
-              <w:br/>
+              <w:t>SOURCE:</w:t>
             </w:r>
             <w:r>
               <w:rPr>
                 <w:i/>
                 <w:sz w:val="10"/>
               </w:rPr>
-              <w:t>https://doi.org/10.1016/j.jand.2025.02.002</w:t>
+              <w:t xml:space="preserve"> Academy of Nutrition and Dietetics position (2016)</w:t>
+              <w:br/>
             </w:r>
+            <w:hyperlink r:id="rId10">
+              <w:r>
+                <w:rPr>
+                  <w:i/>
+                  <w:sz w:val="10"/>
+                  <w:color w:val="0563C1"/>
+                  <w:u w:val="single"/>
+                </w:rPr>
+                <w:t>https://doi.org/10.1016/j.jand.2016.09.025</w:t>
+              </w:r>
+            </w:hyperlink>
           </w:p>
           <w:p>
             <w:pPr>
@@ -237,13 +258,19 @@
                 <w:b/>
                 <w:sz w:val="14"/>
               </w:rPr>
-              <w:t xml:space="preserve">Protein: </w:t>
+              <w:rPr>
+                <w:b/>
+              </w:rPr>
+              <w:t>Protein:</w:t>
             </w:r>
             <w:r>
               <w:rPr>
                 <w:sz w:val="13"/>
               </w:rPr>
-              <w:t>Plant foods contain all essential amino acids. Meeting total protein and calorie needs matters more than combining proteins at every meal.</w:t>
+              <w:rPr>
+                <w:b w:val="0"/>
+              </w:rPr>
+              <w:t xml:space="preserve"> Plant foods contain all essential amino acids. Meeting total protein and calorie needs matters more than combining proteins at every meal.</w:t>
             </w:r>
           </w:p>
           <w:p>
@@ -255,16 +282,27 @@
                 <w:b/>
                 <w:sz w:val="11"/>
               </w:rPr>
-              <w:t>SOURCE: Mariotti &amp; Gardner, Nutrients (2019)</w:t>
-              <w:br/>
+              <w:t>SOURCE:</w:t>
             </w:r>
             <w:r>
               <w:rPr>
                 <w:i/>
                 <w:sz w:val="10"/>
               </w:rPr>
-              <w:t>https://doi.org/10.3390/nu11112661</w:t>
+              <w:t xml:space="preserve"> Mariotti &amp; Gardner, Nutrients (2019)</w:t>
+              <w:br/>
             </w:r>
+            <w:hyperlink r:id="rId11">
+              <w:r>
+                <w:rPr>
+                  <w:i/>
+                  <w:sz w:val="10"/>
+                  <w:color w:val="0563C1"/>
+                  <w:u w:val="single"/>
+                </w:rPr>
+                <w:t>https://doi.org/10.3390/nu11112661</w:t>
+              </w:r>
+            </w:hyperlink>
           </w:p>
           <w:p>
             <w:pPr>
@@ -275,13 +313,19 @@
                 <w:b/>
                 <w:sz w:val="14"/>
               </w:rPr>
-              <w:t xml:space="preserve">RCT evidence: </w:t>
+              <w:rPr>
+                <w:b/>
+              </w:rPr>
+              <w:t>RCT evidence:</w:t>
             </w:r>
             <w:r>
               <w:rPr>
                 <w:sz w:val="13"/>
               </w:rPr>
-              <w:t>An 8-week randomized identical-twin trial found lower LDL cholesterol, body weight and fasting insulin in the vegan group.</w:t>
+              <w:rPr>
+                <w:b w:val="0"/>
+              </w:rPr>
+              <w:t xml:space="preserve"> An 8-week randomized identical-twin trial found lower LDL cholesterol, body weight and fasting insulin in the vegan group.</w:t>
             </w:r>
           </w:p>
           <w:p>
@@ -293,16 +337,27 @@
                 <w:b/>
                 <w:sz w:val="11"/>
               </w:rPr>
-              <w:t>SOURCE: Landry et al., JAMA Network Open (2023)</w:t>
-              <w:br/>
+              <w:t>SOURCE:</w:t>
             </w:r>
             <w:r>
               <w:rPr>
                 <w:i/>
                 <w:sz w:val="10"/>
               </w:rPr>
-              <w:t>https://doi.org/10.1001/jamanetworkopen.2023.44457</w:t>
+              <w:t xml:space="preserve"> Landry et al., JAMA Network Open (2023)</w:t>
+              <w:br/>
             </w:r>
+            <w:hyperlink r:id="rId12">
+              <w:r>
+                <w:rPr>
+                  <w:i/>
+                  <w:sz w:val="10"/>
+                  <w:color w:val="0563C1"/>
+                  <w:u w:val="single"/>
+                </w:rPr>
+                <w:t>https://doi.org/10.1001/jamanetworkopen.2023.44457</w:t>
+              </w:r>
+            </w:hyperlink>
           </w:p>
         </w:tc>
         <w:tc>
@@ -327,7 +382,7 @@
                 <w:b/>
                 <w:sz w:val="15"/>
               </w:rPr>
-              <w:t>6. SOY - GET THE NUMBERS RIGHT</w:t>
+              <w:t>6. DEFORESTATION / SOY</w:t>
             </w:r>
           </w:p>
           <w:p>
@@ -339,13 +394,19 @@
                 <w:b/>
                 <w:sz w:val="14"/>
               </w:rPr>
-              <w:t xml:space="preserve">Global soy use: </w:t>
+              <w:rPr>
+                <w:b/>
+              </w:rPr>
+              <w:t>Global soy use:</w:t>
             </w:r>
             <w:r>
               <w:rPr>
                 <w:sz w:val="13"/>
               </w:rPr>
-              <w:t>About 77% of global soy is used for livestock feed. Only about 7% is used directly for foods such as tofu, soy milk, tempeh and edamame. The remaining share includes soybean oil plus smaller biofuel/industrial uses - not 60% industrial use.</w:t>
+              <w:rPr>
+                <w:b w:val="0"/>
+              </w:rPr>
+              <w:t xml:space="preserve"> About 77% of global soy is used for livestock feed; only a small share is eaten directly as soy foods.</w:t>
             </w:r>
           </w:p>
           <w:p>
@@ -357,16 +418,27 @@
                 <w:b/>
                 <w:sz w:val="11"/>
               </w:rPr>
-              <w:t>SOURCE: Our World in Data synthesis of FCRN/USDA data</w:t>
-              <w:br/>
+              <w:t>SOURCE:</w:t>
             </w:r>
             <w:r>
               <w:rPr>
                 <w:i/>
                 <w:sz w:val="10"/>
               </w:rPr>
-              <w:t>https://ourworldindata.org/drivers-of-deforestation</w:t>
+              <w:t xml:space="preserve"> Our World in Data synthesis of FCRN/USDA data</w:t>
+              <w:br/>
             </w:r>
+            <w:hyperlink r:id="rId13">
+              <w:r>
+                <w:rPr>
+                  <w:i/>
+                  <w:sz w:val="10"/>
+                  <w:color w:val="0563C1"/>
+                  <w:u w:val="single"/>
+                </w:rPr>
+                <w:t>https://ourworldindata.org/soy</w:t>
+              </w:r>
+            </w:hyperlink>
           </w:p>
           <w:p>
             <w:pPr>
@@ -377,13 +449,19 @@
                 <w:b/>
                 <w:sz w:val="14"/>
               </w:rPr>
-              <w:t xml:space="preserve">Deforestation context: </w:t>
+              <w:rPr>
+                <w:b/>
+              </w:rPr>
+              <w:t>Deforestation:</w:t>
             </w:r>
             <w:r>
               <w:rPr>
                 <w:sz w:val="13"/>
               </w:rPr>
-              <w:t>In the Brazilian Amazon, pasture expansion for beef has been a much larger direct driver of deforestation than soy for human foods.</w:t>
+              <w:rPr>
+                <w:b w:val="0"/>
+              </w:rPr>
+              <w:t xml:space="preserve"> Pasture expansion for cattle has been a much larger direct driver of Brazilian Amazon forest loss than soy for human foods.</w:t>
             </w:r>
           </w:p>
           <w:p>
@@ -395,16 +473,27 @@
                 <w:b/>
                 <w:sz w:val="11"/>
               </w:rPr>
-              <w:t>SOURCE: Tyukavina et al., Science Advances (2017)</w:t>
-              <w:br/>
+              <w:t>SOURCE:</w:t>
             </w:r>
             <w:r>
               <w:rPr>
                 <w:i/>
                 <w:sz w:val="10"/>
               </w:rPr>
-              <w:t>https://doi.org/10.1126/sciadv.1601047</w:t>
+              <w:t xml:space="preserve"> Tyukavina et al., Science Advances (2017)</w:t>
+              <w:br/>
             </w:r>
+            <w:hyperlink r:id="rId14">
+              <w:r>
+                <w:rPr>
+                  <w:i/>
+                  <w:sz w:val="10"/>
+                  <w:color w:val="0563C1"/>
+                  <w:u w:val="single"/>
+                </w:rPr>
+                <w:t>https://doi.org/10.1126/sciadv.1601047</w:t>
+              </w:r>
+            </w:hyperlink>
           </w:p>
         </w:tc>
         <w:tc>
@@ -429,7 +518,7 @@
                 <w:b/>
                 <w:sz w:val="15"/>
               </w:rPr>
-              <w:t>11. DOGS / CATS</w:t>
+              <w:t>11. CLIMATE / WATER / BIODIVERSITY</w:t>
             </w:r>
           </w:p>
           <w:p>
@@ -441,13 +530,19 @@
                 <w:b/>
                 <w:sz w:val="14"/>
               </w:rPr>
-              <w:t xml:space="preserve">Dogs: </w:t>
+              <w:rPr>
+                <w:b/>
+              </w:rPr>
+              <w:t>Climate:</w:t>
             </w:r>
             <w:r>
               <w:rPr>
                 <w:sz w:val="13"/>
               </w:rPr>
-              <w:t>A 12-month prospective study found dogs maintained clinical, hematological and nutritional health on a complete commercial plant-based diet.</w:t>
+              <w:rPr>
+                <w:b w:val="0"/>
+              </w:rPr>
+              <w:t xml:space="preserve"> The IPCC finds diets high in plant protein and low in meat and dairy are associated with lower greenhouse-gas emissions, with land-sparing and nutrient-loss co-benefits.</w:t>
             </w:r>
           </w:p>
           <w:p>
@@ -459,16 +554,27 @@
                 <w:b/>
                 <w:sz w:val="11"/>
               </w:rPr>
-              <w:t>SOURCE: Knight et al. (2024)</w:t>
-              <w:br/>
+              <w:t>SOURCE:</w:t>
             </w:r>
             <w:r>
               <w:rPr>
                 <w:i/>
                 <w:sz w:val="10"/>
               </w:rPr>
-              <w:t>https://pubmed.ncbi.nlm.nih.gov/38625934/</w:t>
+              <w:t xml:space="preserve"> IPCC AR6 WGIII, Chapter 12</w:t>
+              <w:br/>
             </w:r>
+            <w:hyperlink r:id="rId17">
+              <w:r>
+                <w:rPr>
+                  <w:i/>
+                  <w:sz w:val="10"/>
+                  <w:color w:val="0563C1"/>
+                  <w:u w:val="single"/>
+                </w:rPr>
+                <w:t>https://www.ipcc.ch/report/ar6/wg3/chapter/chapter-12/</w:t>
+              </w:r>
+            </w:hyperlink>
           </w:p>
           <w:p>
             <w:pPr>
@@ -479,13 +585,19 @@
                 <w:b/>
                 <w:sz w:val="14"/>
               </w:rPr>
-              <w:t xml:space="preserve">Cats: </w:t>
+              <w:rPr>
+                <w:b/>
+              </w:rPr>
+              <w:t>Water / pollution / biodiversity:</w:t>
             </w:r>
             <w:r>
               <w:rPr>
                 <w:sz w:val="13"/>
               </w:rPr>
-              <w:t>A study of 1,369 cats found no statistically significant overall health disadvantage for cats fed vegan diets; formulation and nutrient adequacy remain essential.</w:t>
+              <w:rPr>
+                <w:b w:val="0"/>
+              </w:rPr>
+              <w:t xml:space="preserve"> Vegan diets were about 46% of high-meat diets for water use, 27% for eutrophication and 34% for biodiversity impact.</w:t>
             </w:r>
           </w:p>
           <w:p>
@@ -497,16 +609,27 @@
                 <w:b/>
                 <w:sz w:val="11"/>
               </w:rPr>
-              <w:t>SOURCE: Knight et al., PLOS ONE (2023)</w:t>
-              <w:br/>
+              <w:t>SOURCE:</w:t>
             </w:r>
             <w:r>
               <w:rPr>
                 <w:i/>
                 <w:sz w:val="10"/>
               </w:rPr>
-              <w:t>https://pubmed.ncbi.nlm.nih.gov/37703240/</w:t>
+              <w:t xml:space="preserve"> Scarborough et al., Nature Food (2023)</w:t>
+              <w:br/>
             </w:r>
+            <w:hyperlink r:id="rId16">
+              <w:r>
+                <w:rPr>
+                  <w:i/>
+                  <w:sz w:val="10"/>
+                  <w:color w:val="0563C1"/>
+                  <w:u w:val="single"/>
+                </w:rPr>
+                <w:t>https://doi.org/10.1038/s43016-023-00795-w</w:t>
+              </w:r>
+            </w:hyperlink>
           </w:p>
         </w:tc>
       </w:tr>
@@ -566,13 +689,17 @@
               <w:t>SOURCE: NIH Office of Dietary Supplements</w:t>
               <w:br/>
             </w:r>
-            <w:r>
-              <w:rPr>
-                <w:i/>
-                <w:sz w:val="10"/>
-              </w:rPr>
-              <w:t>https://ods.od.nih.gov/factsheets/VitaminB12-HealthProfessional/</w:t>
-            </w:r>
+            <w:hyperlink r:id="rId19">
+              <w:r>
+                <w:rPr>
+                  <w:i/>
+                  <w:sz w:val="10"/>
+                  <w:color w:val="0563C1"/>
+                  <w:u w:val="single"/>
+                </w:rPr>
+                <w:t>https://ods.od.nih.gov/factsheets/VitaminB12-HealthProfessional/</w:t>
+              </w:r>
+            </w:hyperlink>
           </w:p>
           <w:p>
             <w:pPr>
@@ -604,13 +731,17 @@
               <w:t>SOURCE: Melina et al., J Acad Nutr Diet (2016)</w:t>
               <w:br/>
             </w:r>
-            <w:r>
-              <w:rPr>
-                <w:i/>
-                <w:sz w:val="10"/>
-              </w:rPr>
-              <w:t>https://doi.org/10.1016/j.jand.2016.09.025</w:t>
-            </w:r>
+            <w:hyperlink r:id="rId10">
+              <w:r>
+                <w:rPr>
+                  <w:i/>
+                  <w:sz w:val="10"/>
+                  <w:color w:val="0563C1"/>
+                  <w:u w:val="single"/>
+                </w:rPr>
+                <w:t>https://doi.org/10.1016/j.jand.2016.09.025</w:t>
+              </w:r>
+            </w:hyperlink>
           </w:p>
         </w:tc>
         <w:tc>
@@ -647,13 +778,19 @@
                 <w:b/>
                 <w:sz w:val="14"/>
               </w:rPr>
-              <w:t xml:space="preserve">Land use: </w:t>
+              <w:rPr>
+                <w:b/>
+              </w:rPr>
+              <w:t>Land efficiency:</w:t>
             </w:r>
             <w:r>
               <w:rPr>
                 <w:sz w:val="13"/>
               </w:rPr>
-              <w:t>Meat and dairy use most agricultural land while supplying a minority of global calories and protein. A no-animal-product scenario greatly reduces agricultural land demand.</w:t>
+              <w:rPr>
+                <w:b w:val="0"/>
+              </w:rPr>
+              <w:t xml:space="preserve"> Animal products use about 83% of global farmland while providing about 18% of calories and 37% of protein; a no-animal-product scenario cut modeled agricultural land use about 76%.</w:t>
             </w:r>
           </w:p>
           <w:p>
@@ -665,16 +802,27 @@
                 <w:b/>
                 <w:sz w:val="11"/>
               </w:rPr>
-              <w:t>SOURCE: Poore &amp; Nemecek, Science (2018)</w:t>
-              <w:br/>
+              <w:t>SOURCE:</w:t>
             </w:r>
             <w:r>
               <w:rPr>
                 <w:i/>
                 <w:sz w:val="10"/>
               </w:rPr>
-              <w:t>https://doi.org/10.1126/science.aaq0216</w:t>
+              <w:t xml:space="preserve"> Poore &amp; Nemecek, Science (2018)</w:t>
+              <w:br/>
             </w:r>
+            <w:hyperlink r:id="rId15">
+              <w:r>
+                <w:rPr>
+                  <w:i/>
+                  <w:sz w:val="10"/>
+                  <w:color w:val="0563C1"/>
+                  <w:u w:val="single"/>
+                </w:rPr>
+                <w:t>https://doi.org/10.1126/science.aaq0216</w:t>
+              </w:r>
+            </w:hyperlink>
           </w:p>
           <w:p>
             <w:pPr>
@@ -685,13 +833,19 @@
                 <w:b/>
                 <w:sz w:val="14"/>
               </w:rPr>
-              <w:t xml:space="preserve">Real-world diets: </w:t>
+              <w:rPr>
+                <w:b/>
+              </w:rPr>
+              <w:t>Real-world diets:</w:t>
             </w:r>
             <w:r>
               <w:rPr>
                 <w:sz w:val="13"/>
               </w:rPr>
-              <w:t>A large UK analysis found vegan diets had substantially lower greenhouse-gas emissions, land use, water use, eutrophication and biodiversity impacts than high-meat diets.</w:t>
+              <w:rPr>
+                <w:b w:val="0"/>
+              </w:rPr>
+              <w:t xml:space="preserve"> Vegan diets were about 25% of high-meat diets for greenhouse-gas emissions and land use in a 55,504-person UK analysis.</w:t>
             </w:r>
           </w:p>
           <w:p>
@@ -703,16 +857,27 @@
                 <w:b/>
                 <w:sz w:val="11"/>
               </w:rPr>
-              <w:t>SOURCE: Scarborough et al., Nature Food (2023)</w:t>
-              <w:br/>
+              <w:t>SOURCE:</w:t>
             </w:r>
             <w:r>
               <w:rPr>
                 <w:i/>
                 <w:sz w:val="10"/>
               </w:rPr>
-              <w:t>https://doi.org/10.1038/s43016-023-00795-w</w:t>
+              <w:t xml:space="preserve"> Scarborough et al., Nature Food (2023)</w:t>
+              <w:br/>
             </w:r>
+            <w:hyperlink r:id="rId16">
+              <w:r>
+                <w:rPr>
+                  <w:i/>
+                  <w:sz w:val="10"/>
+                  <w:color w:val="0563C1"/>
+                  <w:u w:val="single"/>
+                </w:rPr>
+                <w:t>https://doi.org/10.1038/s43016-023-00795-w</w:t>
+              </w:r>
+            </w:hyperlink>
           </w:p>
         </w:tc>
         <w:tc>
@@ -770,13 +935,17 @@
               <w:t>SOURCE: Kahleova et al., JAMA Network Open (2023)</w:t>
               <w:br/>
             </w:r>
-            <w:r>
-              <w:rPr>
-                <w:i/>
-                <w:sz w:val="10"/>
-              </w:rPr>
-              <w:t>https://pubmed.ncbi.nlm.nih.gov/37669055/</w:t>
-            </w:r>
+            <w:hyperlink r:id="rId20">
+              <w:r>
+                <w:rPr>
+                  <w:i/>
+                  <w:sz w:val="10"/>
+                  <w:color w:val="0563C1"/>
+                  <w:u w:val="single"/>
+                </w:rPr>
+                <w:t>https://pubmed.ncbi.nlm.nih.gov/37669055/</w:t>
+              </w:r>
+            </w:hyperlink>
           </w:p>
           <w:p>
             <w:pPr>
@@ -808,13 +977,17 @@
               <w:t>SOURCE: Study above + basic commodity foods</w:t>
               <w:br/>
             </w:r>
-            <w:r>
-              <w:rPr>
-                <w:i/>
-                <w:sz w:val="10"/>
-              </w:rPr>
-              <w:t>https://pubmed.ncbi.nlm.nih.gov/37669055/</w:t>
-            </w:r>
+            <w:hyperlink r:id="rId20">
+              <w:r>
+                <w:rPr>
+                  <w:i/>
+                  <w:sz w:val="10"/>
+                  <w:color w:val="0563C1"/>
+                  <w:u w:val="single"/>
+                </w:rPr>
+                <w:t>https://pubmed.ncbi.nlm.nih.gov/37669055/</w:t>
+              </w:r>
+            </w:hyperlink>
           </w:p>
         </w:tc>
       </w:tr>
@@ -874,13 +1047,17 @@
               <w:t>SOURCE: Taiz et al., Trends in Plant Science (2020)</w:t>
               <w:br/>
             </w:r>
-            <w:r>
-              <w:rPr>
-                <w:i/>
-                <w:sz w:val="10"/>
-              </w:rPr>
-              <w:t>https://doi.org/10.1016/j.tplants.2020.05.005</w:t>
-            </w:r>
+            <w:hyperlink r:id="rId21">
+              <w:r>
+                <w:rPr>
+                  <w:i/>
+                  <w:sz w:val="10"/>
+                  <w:color w:val="0563C1"/>
+                  <w:u w:val="single"/>
+                </w:rPr>
+                <w:t>https://doi.org/10.1016/j.tplants.2020.05.005</w:t>
+              </w:r>
+            </w:hyperlink>
           </w:p>
           <w:p>
             <w:pPr>
@@ -912,13 +1089,17 @@
               <w:t>SOURCE: Birch et al., LSE sentience review (2021)</w:t>
               <w:br/>
             </w:r>
-            <w:r>
-              <w:rPr>
-                <w:i/>
-                <w:sz w:val="10"/>
-              </w:rPr>
-              <w:t>https://www.lse.ac.uk/business/consulting/assets/documents/invertebrate-sentience.pdf</w:t>
-            </w:r>
+            <w:hyperlink r:id="rId22">
+              <w:r>
+                <w:rPr>
+                  <w:i/>
+                  <w:sz w:val="10"/>
+                  <w:color w:val="0563C1"/>
+                  <w:u w:val="single"/>
+                </w:rPr>
+                <w:t>https://www.lse.ac.uk/business/consulting/assets/documents/invertebrate-sentience.pdf</w:t>
+              </w:r>
+            </w:hyperlink>
           </w:p>
         </w:tc>
         <w:tc>
@@ -976,13 +1157,17 @@
               <w:t>SOURCE: Ethical distinction; welfare evidence reviewed by EFSA</w:t>
               <w:br/>
             </w:r>
-            <w:r>
-              <w:rPr>
-                <w:i/>
-                <w:sz w:val="10"/>
-              </w:rPr>
-              <w:t>https://www.efsa.europa.eu/en/topics/topic/animal-welfare</w:t>
-            </w:r>
+            <w:hyperlink r:id="rId23">
+              <w:r>
+                <w:rPr>
+                  <w:i/>
+                  <w:sz w:val="10"/>
+                  <w:color w:val="0563C1"/>
+                  <w:u w:val="single"/>
+                </w:rPr>
+                <w:t>https://www.efsa.europa.eu/en/topics/topic/animal-welfare</w:t>
+              </w:r>
+            </w:hyperlink>
           </w:p>
           <w:p>
             <w:pPr>
@@ -1014,13 +1199,17 @@
               <w:t>SOURCE: EFSA Journal - animal transport opinions</w:t>
               <w:br/>
             </w:r>
-            <w:r>
-              <w:rPr>
-                <w:i/>
-                <w:sz w:val="10"/>
-              </w:rPr>
-              <w:t>https://www.efsa.europa.eu/en/topics/topic/animal-welfare</w:t>
-            </w:r>
+            <w:hyperlink r:id="rId23">
+              <w:r>
+                <w:rPr>
+                  <w:i/>
+                  <w:sz w:val="10"/>
+                  <w:color w:val="0563C1"/>
+                  <w:u w:val="single"/>
+                </w:rPr>
+                <w:t>https://www.efsa.europa.eu/en/topics/topic/animal-welfare</w:t>
+              </w:r>
+            </w:hyperlink>
           </w:p>
         </w:tc>
         <w:tc>
@@ -1078,13 +1267,17 @@
               <w:t>SOURCE: Tang et al., Lancet Planetary Health (2017)</w:t>
               <w:br/>
             </w:r>
-            <w:r>
-              <w:rPr>
-                <w:i/>
-                <w:sz w:val="10"/>
-              </w:rPr>
-              <w:t>https://doi.org/10.1016/S2542-5196(17)30141-9</w:t>
-            </w:r>
+            <w:hyperlink r:id="rId24">
+              <w:r>
+                <w:rPr>
+                  <w:i/>
+                  <w:sz w:val="10"/>
+                  <w:color w:val="0563C1"/>
+                  <w:u w:val="single"/>
+                </w:rPr>
+                <w:t>https://doi.org/10.1016/S2542-5196(17)30141-9</w:t>
+              </w:r>
+            </w:hyperlink>
           </w:p>
           <w:p>
             <w:pPr>
@@ -1116,13 +1309,17 @@
               <w:t>SOURCE: Jones et al., Nature (2008)</w:t>
               <w:br/>
             </w:r>
-            <w:r>
-              <w:rPr>
-                <w:i/>
-                <w:sz w:val="10"/>
-              </w:rPr>
-              <w:t>https://doi.org/10.1038/nature06536</w:t>
-            </w:r>
+            <w:hyperlink r:id="rId25">
+              <w:r>
+                <w:rPr>
+                  <w:i/>
+                  <w:sz w:val="10"/>
+                  <w:color w:val="0563C1"/>
+                  <w:u w:val="single"/>
+                </w:rPr>
+                <w:t>https://doi.org/10.1038/nature06536</w:t>
+              </w:r>
+            </w:hyperlink>
           </w:p>
         </w:tc>
       </w:tr>
@@ -1182,13 +1379,17 @@
               <w:t>SOURCE: Logic: appeal-to-nature distinction</w:t>
               <w:br/>
             </w:r>
-            <w:r>
-              <w:rPr>
-                <w:i/>
-                <w:sz w:val="10"/>
-              </w:rPr>
-              <w:t>https://plato.stanford.edu/entries/moral-animal/</w:t>
-            </w:r>
+            <w:hyperlink r:id="rId26">
+              <w:r>
+                <w:rPr>
+                  <w:i/>
+                  <w:sz w:val="10"/>
+                  <w:color w:val="0563C1"/>
+                  <w:u w:val="single"/>
+                </w:rPr>
+                <w:t>https://plato.stanford.edu/entries/moral-animal/</w:t>
+              </w:r>
+            </w:hyperlink>
           </w:p>
           <w:p>
             <w:pPr>
@@ -1217,16 +1418,27 @@
                 <w:b/>
                 <w:sz w:val="11"/>
               </w:rPr>
-              <w:t>SOURCE: Academy of Nutrition and Dietetics (2025)</w:t>
-              <w:br/>
+              <w:t>SOURCE:</w:t>
             </w:r>
             <w:r>
               <w:rPr>
                 <w:i/>
                 <w:sz w:val="10"/>
               </w:rPr>
-              <w:t>https://doi.org/10.1016/j.jand.2025.02.002</w:t>
+              <w:t xml:space="preserve"> Academy of Nutrition and Dietetics (2016)</w:t>
+              <w:br/>
             </w:r>
+            <w:hyperlink r:id="rId10">
+              <w:r>
+                <w:rPr>
+                  <w:i/>
+                  <w:sz w:val="10"/>
+                  <w:color w:val="0563C1"/>
+                  <w:u w:val="single"/>
+                </w:rPr>
+                <w:t>https://doi.org/10.1016/j.jand.2016.09.025</w:t>
+              </w:r>
+            </w:hyperlink>
           </w:p>
         </w:tc>
         <w:tc>
@@ -1284,13 +1496,17 @@
               <w:t>SOURCE: Meagher et al., Applied Animal Behaviour Science (2019)</w:t>
               <w:br/>
             </w:r>
-            <w:r>
-              <w:rPr>
-                <w:i/>
-                <w:sz w:val="10"/>
-              </w:rPr>
-              <w:t>https://doi.org/10.1016/j.applanim.2018.11.011</w:t>
-            </w:r>
+            <w:hyperlink r:id="rId27">
+              <w:r>
+                <w:rPr>
+                  <w:i/>
+                  <w:sz w:val="10"/>
+                  <w:color w:val="0563C1"/>
+                  <w:u w:val="single"/>
+                </w:rPr>
+                <w:t>https://doi.org/10.1016/j.applanim.2018.11.011</w:t>
+              </w:r>
+            </w:hyperlink>
           </w:p>
           <w:p>
             <w:pPr>
@@ -1322,13 +1538,17 @@
               <w:t>SOURCE: Lay et al., Poultry Science (2011)</w:t>
               <w:br/>
             </w:r>
-            <w:r>
-              <w:rPr>
-                <w:i/>
-                <w:sz w:val="10"/>
-              </w:rPr>
-              <w:t>https://doi.org/10.3382/ps.2010-00962</w:t>
-            </w:r>
+            <w:hyperlink r:id="rId28">
+              <w:r>
+                <w:rPr>
+                  <w:i/>
+                  <w:sz w:val="10"/>
+                  <w:color w:val="0563C1"/>
+                  <w:u w:val="single"/>
+                </w:rPr>
+                <w:t>https://doi.org/10.3382/ps.2010-00962</w:t>
+              </w:r>
+            </w:hyperlink>
           </w:p>
         </w:tc>
         <w:tc>
@@ -1386,13 +1606,17 @@
               <w:t>SOURCE: Consumer ethics / expected-demand argument</w:t>
               <w:br/>
             </w:r>
-            <w:r>
-              <w:rPr>
-                <w:i/>
-                <w:sz w:val="10"/>
-              </w:rPr>
-              <w:t>https://plato.stanford.edu/entries/vegetarianism/</w:t>
-            </w:r>
+            <w:hyperlink r:id="rId29">
+              <w:r>
+                <w:rPr>
+                  <w:i/>
+                  <w:sz w:val="10"/>
+                  <w:color w:val="0563C1"/>
+                  <w:u w:val="single"/>
+                </w:rPr>
+                <w:t>https://plato.stanford.edu/entries/vegetarianism/</w:t>
+              </w:r>
+            </w:hyperlink>
           </w:p>
           <w:p>
             <w:pPr>
@@ -1424,13 +1648,17 @@
               <w:t>SOURCE: Ethical argument - not a scientific claim</w:t>
               <w:br/>
             </w:r>
-            <w:r>
-              <w:rPr>
-                <w:i/>
-                <w:sz w:val="10"/>
-              </w:rPr>
-              <w:t>https://plato.stanford.edu/entries/moral-animal/</w:t>
-            </w:r>
+            <w:hyperlink r:id="rId26">
+              <w:r>
+                <w:rPr>
+                  <w:i/>
+                  <w:sz w:val="10"/>
+                  <w:color w:val="0563C1"/>
+                  <w:u w:val="single"/>
+                </w:rPr>
+                <w:t>https://plato.stanford.edu/entries/moral-animal/</w:t>
+              </w:r>
+            </w:hyperlink>
           </w:p>
         </w:tc>
       </w:tr>
@@ -1490,13 +1718,17 @@
               <w:t>SOURCE: Poore &amp; Nemecek, Science (2018)</w:t>
               <w:br/>
             </w:r>
-            <w:r>
-              <w:rPr>
-                <w:i/>
-                <w:sz w:val="10"/>
-              </w:rPr>
-              <w:t>https://doi.org/10.1126/science.aaq0216</w:t>
-            </w:r>
+            <w:hyperlink r:id="rId15">
+              <w:r>
+                <w:rPr>
+                  <w:i/>
+                  <w:sz w:val="10"/>
+                  <w:color w:val="0563C1"/>
+                  <w:u w:val="single"/>
+                </w:rPr>
+                <w:t>https://doi.org/10.1126/science.aaq0216</w:t>
+              </w:r>
+            </w:hyperlink>
           </w:p>
           <w:p>
             <w:pPr>
@@ -1528,13 +1760,17 @@
               <w:t>SOURCE: Cassidy et al., Environmental Research Letters (2013)</w:t>
               <w:br/>
             </w:r>
-            <w:r>
-              <w:rPr>
-                <w:i/>
-                <w:sz w:val="10"/>
-              </w:rPr>
-              <w:t>https://doi.org/10.1088/1748-9326/8/3/034015</w:t>
-            </w:r>
+            <w:hyperlink r:id="rId30">
+              <w:r>
+                <w:rPr>
+                  <w:i/>
+                  <w:sz w:val="10"/>
+                  <w:color w:val="0563C1"/>
+                  <w:u w:val="single"/>
+                </w:rPr>
+                <w:t>https://doi.org/10.1088/1748-9326/8/3/034015</w:t>
+              </w:r>
+            </w:hyperlink>
           </w:p>
         </w:tc>
         <w:tc>
@@ -1592,13 +1828,17 @@
               <w:t>SOURCE: Sneddon et al., Philosophical Transactions B (2014)</w:t>
               <w:br/>
             </w:r>
-            <w:r>
-              <w:rPr>
-                <w:i/>
-                <w:sz w:val="10"/>
-              </w:rPr>
-              <w:t>https://doi.org/10.1098/rstb.2013.0086</w:t>
-            </w:r>
+            <w:hyperlink r:id="rId31">
+              <w:r>
+                <w:rPr>
+                  <w:i/>
+                  <w:sz w:val="10"/>
+                  <w:color w:val="0563C1"/>
+                  <w:u w:val="single"/>
+                </w:rPr>
+                <w:t>https://doi.org/10.1098/rstb.2013.0086</w:t>
+              </w:r>
+            </w:hyperlink>
           </w:p>
           <w:p>
             <w:pPr>
@@ -1630,13 +1870,17 @@
               <w:t>SOURCE: Mood et al., Animal Welfare (2024)</w:t>
               <w:br/>
             </w:r>
-            <w:r>
-              <w:rPr>
-                <w:i/>
-                <w:sz w:val="10"/>
-              </w:rPr>
-              <w:t>https://pubmed.ncbi.nlm.nih.gov/38487450/</w:t>
-            </w:r>
+            <w:hyperlink r:id="rId32">
+              <w:r>
+                <w:rPr>
+                  <w:i/>
+                  <w:sz w:val="10"/>
+                  <w:color w:val="0563C1"/>
+                  <w:u w:val="single"/>
+                </w:rPr>
+                <w:t>https://pubmed.ncbi.nlm.nih.gov/38487450/</w:t>
+              </w:r>
+            </w:hyperlink>
           </w:p>
         </w:tc>
         <w:tc>
@@ -1694,13 +1938,35 @@
               <w:t>SOURCE: Practical examples: Transfarmation + Rowdy Girl Rancher Advocacy</w:t>
               <w:br/>
             </w:r>
+            <w:hyperlink r:id="rId33">
+              <w:r>
+                <w:rPr>
+                  <w:i/>
+                  <w:sz w:val="10"/>
+                  <w:color w:val="0563C1"/>
+                  <w:u w:val="single"/>
+                </w:rPr>
+                <w:t>https://transfarmationproject.org/</w:t>
+              </w:r>
+            </w:hyperlink>
             <w:r>
               <w:rPr>
                 <w:i/>
                 <w:sz w:val="10"/>
               </w:rPr>
-              <w:t>https://transfarmationproject.org/  |  https://rowdygirlsanctuary.org/</w:t>
+              <w:t xml:space="preserve">  |  </w:t>
             </w:r>
+            <w:hyperlink r:id="rId34">
+              <w:r>
+                <w:rPr>
+                  <w:i/>
+                  <w:sz w:val="10"/>
+                  <w:color w:val="0563C1"/>
+                  <w:u w:val="single"/>
+                </w:rPr>
+                <w:t>https://rowdygirlsanctuary.org/</w:t>
+              </w:r>
+            </w:hyperlink>
           </w:p>
           <w:p>
             <w:pPr>
@@ -1732,13 +1998,17 @@
               <w:t>SOURCE: Source type clearly labeled</w:t>
               <w:br/>
             </w:r>
-            <w:r>
-              <w:rPr>
-                <w:i/>
-                <w:sz w:val="10"/>
-              </w:rPr>
-              <w:t>https://transfarmationproject.org/</w:t>
-            </w:r>
+            <w:hyperlink r:id="rId33">
+              <w:r>
+                <w:rPr>
+                  <w:i/>
+                  <w:sz w:val="10"/>
+                  <w:color w:val="0563C1"/>
+                  <w:u w:val="single"/>
+                </w:rPr>
+                <w:t>https://transfarmationproject.org/</w:t>
+              </w:r>
+            </w:hyperlink>
           </w:p>
         </w:tc>
       </w:tr>

</xml_diff>